<commit_message>
Cleanup: Removed legacy Dash files and structured project for React + FastAPI architecture
</commit_message>
<xml_diff>
--- a/Documentation.docx
+++ b/Documentation.docx
@@ -9,17 +9,17 @@
           <w:rFonts w:ascii="Times New Roman" w:hAnsi="Times New Roman" w:cs="Times New Roman"/>
           <w:b/>
           <w:bCs/>
-          <w:sz w:val="40"/>
-          <w:szCs w:val="40"/>
-        </w:rPr>
-      </w:pPr>
-      <w:r>
-        <w:rPr>
-          <w:rFonts w:ascii="Times New Roman" w:hAnsi="Times New Roman" w:cs="Times New Roman"/>
-          <w:b/>
-          <w:bCs/>
-          <w:sz w:val="40"/>
-          <w:szCs w:val="40"/>
+          <w:sz w:val="28"/>
+          <w:szCs w:val="28"/>
+        </w:rPr>
+      </w:pPr>
+      <w:r>
+        <w:rPr>
+          <w:rFonts w:ascii="Times New Roman" w:hAnsi="Times New Roman" w:cs="Times New Roman"/>
+          <w:b/>
+          <w:bCs/>
+          <w:sz w:val="28"/>
+          <w:szCs w:val="28"/>
         </w:rPr>
         <w:t>DOCUMENTATION</w:t>
       </w:r>
@@ -317,6 +317,479 @@
           <w:szCs w:val="24"/>
         </w:rPr>
         <w:t> Developed a robust storage pipeline utilizing utils/data_processing.py to save the cleaned data as processed.csv and load it into a local SQLite database (healthcare.db). Created a secure fetch utility to ensure downstream analytics modules receive standardized, structured data.</w:t>
+      </w:r>
+    </w:p>
+    <w:p>
+      <w:pPr>
+        <w:rPr>
+          <w:rFonts w:ascii="Times New Roman" w:hAnsi="Times New Roman" w:cs="Times New Roman"/>
+          <w:b/>
+          <w:bCs/>
+          <w:sz w:val="24"/>
+          <w:szCs w:val="24"/>
+        </w:rPr>
+      </w:pPr>
+    </w:p>
+    <w:p>
+      <w:pPr>
+        <w:rPr>
+          <w:rFonts w:ascii="Times New Roman" w:hAnsi="Times New Roman" w:cs="Times New Roman"/>
+          <w:sz w:val="24"/>
+          <w:szCs w:val="24"/>
+        </w:rPr>
+      </w:pPr>
+      <w:r>
+        <w:rPr>
+          <w:rFonts w:ascii="Times New Roman" w:hAnsi="Times New Roman" w:cs="Times New Roman"/>
+          <w:b/>
+          <w:bCs/>
+          <w:sz w:val="24"/>
+          <w:szCs w:val="24"/>
+        </w:rPr>
+        <w:t>Milestone 2: Patient Flow &amp; Service Demand Intelligence Module</w:t>
+      </w:r>
+    </w:p>
+    <w:p>
+      <w:pPr>
+        <w:rPr>
+          <w:rFonts w:ascii="Times New Roman" w:hAnsi="Times New Roman" w:cs="Times New Roman"/>
+          <w:sz w:val="24"/>
+          <w:szCs w:val="24"/>
+        </w:rPr>
+      </w:pPr>
+      <w:r>
+        <w:rPr>
+          <w:rFonts w:ascii="Times New Roman" w:hAnsi="Times New Roman" w:cs="Times New Roman"/>
+          <w:b/>
+          <w:bCs/>
+          <w:sz w:val="24"/>
+          <w:szCs w:val="24"/>
+        </w:rPr>
+        <w:t>Objective:</w:t>
+      </w:r>
+      <w:r>
+        <w:rPr>
+          <w:rFonts w:ascii="Times New Roman" w:hAnsi="Times New Roman" w:cs="Times New Roman"/>
+          <w:sz w:val="24"/>
+          <w:szCs w:val="24"/>
+        </w:rPr>
+        <w:t> Developed advanced analytics for real-time patient movement and operational demand monitoring.</w:t>
+      </w:r>
+    </w:p>
+    <w:p>
+      <w:pPr>
+        <w:rPr>
+          <w:rFonts w:ascii="Times New Roman" w:hAnsi="Times New Roman" w:cs="Times New Roman"/>
+          <w:sz w:val="24"/>
+          <w:szCs w:val="24"/>
+        </w:rPr>
+      </w:pPr>
+      <w:r>
+        <w:rPr>
+          <w:rFonts w:ascii="Times New Roman" w:hAnsi="Times New Roman" w:cs="Times New Roman"/>
+          <w:b/>
+          <w:bCs/>
+          <w:sz w:val="24"/>
+          <w:szCs w:val="24"/>
+        </w:rPr>
+        <w:t>Implemented Features:</w:t>
+      </w:r>
+    </w:p>
+    <w:p>
+      <w:pPr>
+        <w:numPr>
+          <w:ilvl w:val="0"/>
+          <w:numId w:val="2"/>
+        </w:numPr>
+        <w:rPr>
+          <w:rFonts w:ascii="Times New Roman" w:hAnsi="Times New Roman" w:cs="Times New Roman"/>
+          <w:sz w:val="24"/>
+          <w:szCs w:val="24"/>
+        </w:rPr>
+      </w:pPr>
+      <w:r>
+        <w:rPr>
+          <w:rFonts w:ascii="Times New Roman" w:hAnsi="Times New Roman" w:cs="Times New Roman"/>
+          <w:b/>
+          <w:bCs/>
+          <w:sz w:val="24"/>
+          <w:szCs w:val="24"/>
+        </w:rPr>
+        <w:t>Admission Velocity Tracking:</w:t>
+      </w:r>
+      <w:r>
+        <w:rPr>
+          <w:rFonts w:ascii="Times New Roman" w:hAnsi="Times New Roman" w:cs="Times New Roman"/>
+          <w:sz w:val="24"/>
+          <w:szCs w:val="24"/>
+        </w:rPr>
+        <w:t> Time-series analysis for monitoring admission surges and trends.</w:t>
+      </w:r>
+    </w:p>
+    <w:p>
+      <w:pPr>
+        <w:numPr>
+          <w:ilvl w:val="0"/>
+          <w:numId w:val="2"/>
+        </w:numPr>
+        <w:rPr>
+          <w:rFonts w:ascii="Times New Roman" w:hAnsi="Times New Roman" w:cs="Times New Roman"/>
+          <w:sz w:val="24"/>
+          <w:szCs w:val="24"/>
+        </w:rPr>
+      </w:pPr>
+      <w:r>
+        <w:rPr>
+          <w:rFonts w:ascii="Times New Roman" w:hAnsi="Times New Roman" w:cs="Times New Roman"/>
+          <w:b/>
+          <w:bCs/>
+          <w:sz w:val="24"/>
+          <w:szCs w:val="24"/>
+        </w:rPr>
+        <w:t>Workload Distribution:</w:t>
+      </w:r>
+      <w:r>
+        <w:rPr>
+          <w:rFonts w:ascii="Times New Roman" w:hAnsi="Times New Roman" w:cs="Times New Roman"/>
+          <w:sz w:val="24"/>
+          <w:szCs w:val="24"/>
+        </w:rPr>
+        <w:t> Departmental heat-mapping and bar analysis to identify service bottlenecks.</w:t>
+      </w:r>
+    </w:p>
+    <w:p>
+      <w:pPr>
+        <w:numPr>
+          <w:ilvl w:val="0"/>
+          <w:numId w:val="2"/>
+        </w:numPr>
+        <w:rPr>
+          <w:rFonts w:ascii="Times New Roman" w:hAnsi="Times New Roman" w:cs="Times New Roman"/>
+          <w:sz w:val="24"/>
+          <w:szCs w:val="24"/>
+        </w:rPr>
+      </w:pPr>
+      <w:r>
+        <w:rPr>
+          <w:rFonts w:ascii="Times New Roman" w:hAnsi="Times New Roman" w:cs="Times New Roman"/>
+          <w:b/>
+          <w:bCs/>
+          <w:sz w:val="24"/>
+          <w:szCs w:val="24"/>
+        </w:rPr>
+        <w:t>KPI Scorecards:</w:t>
+      </w:r>
+      <w:r>
+        <w:rPr>
+          <w:rFonts w:ascii="Times New Roman" w:hAnsi="Times New Roman" w:cs="Times New Roman"/>
+          <w:sz w:val="24"/>
+          <w:szCs w:val="24"/>
+        </w:rPr>
+        <w:t xml:space="preserve"> Executive-level summary cards (Total Admissions, </w:t>
+      </w:r>
+      <w:proofErr w:type="spellStart"/>
+      <w:r>
+        <w:rPr>
+          <w:rFonts w:ascii="Times New Roman" w:hAnsi="Times New Roman" w:cs="Times New Roman"/>
+          <w:sz w:val="24"/>
+          <w:szCs w:val="24"/>
+        </w:rPr>
+        <w:t>Avg</w:t>
+      </w:r>
+      <w:proofErr w:type="spellEnd"/>
+      <w:r>
+        <w:rPr>
+          <w:rFonts w:ascii="Times New Roman" w:hAnsi="Times New Roman" w:cs="Times New Roman"/>
+          <w:sz w:val="24"/>
+          <w:szCs w:val="24"/>
+        </w:rPr>
+        <w:t xml:space="preserve"> Stay Duration, Peak Demand) for immediate situational awareness.</w:t>
+      </w:r>
+    </w:p>
+    <w:p>
+      <w:pPr>
+        <w:numPr>
+          <w:ilvl w:val="0"/>
+          <w:numId w:val="2"/>
+        </w:numPr>
+        <w:rPr>
+          <w:rFonts w:ascii="Times New Roman" w:hAnsi="Times New Roman" w:cs="Times New Roman"/>
+          <w:sz w:val="24"/>
+          <w:szCs w:val="24"/>
+        </w:rPr>
+      </w:pPr>
+      <w:r>
+        <w:rPr>
+          <w:rFonts w:ascii="Times New Roman" w:hAnsi="Times New Roman" w:cs="Times New Roman"/>
+          <w:b/>
+          <w:bCs/>
+          <w:sz w:val="24"/>
+          <w:szCs w:val="24"/>
+        </w:rPr>
+        <w:t>UI/UX Design:</w:t>
+      </w:r>
+      <w:r>
+        <w:rPr>
+          <w:rFonts w:ascii="Times New Roman" w:hAnsi="Times New Roman" w:cs="Times New Roman"/>
+          <w:sz w:val="24"/>
+          <w:szCs w:val="24"/>
+        </w:rPr>
+        <w:t> Implemented a high-contrast, dark-mode analytical interface optimized for hospital command centers.</w:t>
+      </w:r>
+    </w:p>
+    <w:p>
+      <w:pPr>
+        <w:rPr>
+          <w:rFonts w:ascii="Times New Roman" w:hAnsi="Times New Roman" w:cs="Times New Roman"/>
+          <w:sz w:val="24"/>
+          <w:szCs w:val="24"/>
+        </w:rPr>
+      </w:pPr>
+      <w:r>
+        <w:rPr>
+          <w:rFonts w:ascii="Times New Roman" w:hAnsi="Times New Roman" w:cs="Times New Roman"/>
+          <w:b/>
+          <w:bCs/>
+          <w:sz w:val="24"/>
+          <w:szCs w:val="24"/>
+        </w:rPr>
+        <w:lastRenderedPageBreak/>
+        <w:t>Operational Impact:</w:t>
+      </w:r>
+      <w:r>
+        <w:rPr>
+          <w:rFonts w:ascii="Times New Roman" w:hAnsi="Times New Roman" w:cs="Times New Roman"/>
+          <w:sz w:val="24"/>
+          <w:szCs w:val="24"/>
+        </w:rPr>
+        <w:t> Enables management to forecast staffing requirements and bed capacity needs based on historical admission patterns.</w:t>
+      </w:r>
+    </w:p>
+    <w:p>
+      <w:pPr>
+        <w:rPr>
+          <w:rFonts w:ascii="Times New Roman" w:hAnsi="Times New Roman" w:cs="Times New Roman"/>
+          <w:b/>
+          <w:bCs/>
+          <w:sz w:val="24"/>
+          <w:szCs w:val="24"/>
+        </w:rPr>
+      </w:pPr>
+    </w:p>
+    <w:p>
+      <w:pPr>
+        <w:rPr>
+          <w:rFonts w:ascii="Times New Roman" w:hAnsi="Times New Roman" w:cs="Times New Roman"/>
+          <w:sz w:val="24"/>
+          <w:szCs w:val="24"/>
+        </w:rPr>
+      </w:pPr>
+      <w:r>
+        <w:rPr>
+          <w:rFonts w:ascii="Times New Roman" w:hAnsi="Times New Roman" w:cs="Times New Roman"/>
+          <w:b/>
+          <w:bCs/>
+          <w:sz w:val="24"/>
+          <w:szCs w:val="24"/>
+        </w:rPr>
+        <w:t>Milestone 3: Resource Utilization &amp; Capacity Intelligence Module</w:t>
+      </w:r>
+    </w:p>
+    <w:p>
+      <w:pPr>
+        <w:rPr>
+          <w:rFonts w:ascii="Times New Roman" w:hAnsi="Times New Roman" w:cs="Times New Roman"/>
+          <w:sz w:val="24"/>
+          <w:szCs w:val="24"/>
+        </w:rPr>
+      </w:pPr>
+      <w:r>
+        <w:rPr>
+          <w:rFonts w:ascii="Times New Roman" w:hAnsi="Times New Roman" w:cs="Times New Roman"/>
+          <w:b/>
+          <w:bCs/>
+          <w:sz w:val="24"/>
+          <w:szCs w:val="24"/>
+        </w:rPr>
+        <w:t>Objective:</w:t>
+      </w:r>
+      <w:r>
+        <w:rPr>
+          <w:rFonts w:ascii="Times New Roman" w:hAnsi="Times New Roman" w:cs="Times New Roman"/>
+          <w:sz w:val="24"/>
+          <w:szCs w:val="24"/>
+        </w:rPr>
+        <w:t> Developed critical resource monitoring capabilities to track facility infrastructure and patient length-of-stay distribution.</w:t>
+      </w:r>
+    </w:p>
+    <w:p>
+      <w:pPr>
+        <w:rPr>
+          <w:rFonts w:ascii="Times New Roman" w:hAnsi="Times New Roman" w:cs="Times New Roman"/>
+          <w:sz w:val="24"/>
+          <w:szCs w:val="24"/>
+        </w:rPr>
+      </w:pPr>
+      <w:r>
+        <w:rPr>
+          <w:rFonts w:ascii="Times New Roman" w:hAnsi="Times New Roman" w:cs="Times New Roman"/>
+          <w:b/>
+          <w:bCs/>
+          <w:sz w:val="24"/>
+          <w:szCs w:val="24"/>
+        </w:rPr>
+        <w:t>Implemented Features:</w:t>
+      </w:r>
+    </w:p>
+    <w:p>
+      <w:pPr>
+        <w:numPr>
+          <w:ilvl w:val="0"/>
+          <w:numId w:val="3"/>
+        </w:numPr>
+        <w:rPr>
+          <w:rFonts w:ascii="Times New Roman" w:hAnsi="Times New Roman" w:cs="Times New Roman"/>
+          <w:sz w:val="24"/>
+          <w:szCs w:val="24"/>
+        </w:rPr>
+      </w:pPr>
+      <w:r>
+        <w:rPr>
+          <w:rFonts w:ascii="Times New Roman" w:hAnsi="Times New Roman" w:cs="Times New Roman"/>
+          <w:b/>
+          <w:bCs/>
+          <w:sz w:val="24"/>
+          <w:szCs w:val="24"/>
+        </w:rPr>
+        <w:t>Facility Bed Mapping:</w:t>
+      </w:r>
+      <w:r>
+        <w:rPr>
+          <w:rFonts w:ascii="Times New Roman" w:hAnsi="Times New Roman" w:cs="Times New Roman"/>
+          <w:sz w:val="24"/>
+          <w:szCs w:val="24"/>
+        </w:rPr>
+        <w:t> Visualized bed utilization across different hospitals to highlight capacity constraints.</w:t>
+      </w:r>
+    </w:p>
+    <w:p>
+      <w:pPr>
+        <w:numPr>
+          <w:ilvl w:val="0"/>
+          <w:numId w:val="3"/>
+        </w:numPr>
+        <w:rPr>
+          <w:rFonts w:ascii="Times New Roman" w:hAnsi="Times New Roman" w:cs="Times New Roman"/>
+          <w:sz w:val="24"/>
+          <w:szCs w:val="24"/>
+        </w:rPr>
+      </w:pPr>
+      <w:r>
+        <w:rPr>
+          <w:rFonts w:ascii="Times New Roman" w:hAnsi="Times New Roman" w:cs="Times New Roman"/>
+          <w:b/>
+          <w:bCs/>
+          <w:sz w:val="24"/>
+          <w:szCs w:val="24"/>
+        </w:rPr>
+        <w:t>Stay Duration Profiling:</w:t>
+      </w:r>
+      <w:r>
+        <w:rPr>
+          <w:rFonts w:ascii="Times New Roman" w:hAnsi="Times New Roman" w:cs="Times New Roman"/>
+          <w:sz w:val="24"/>
+          <w:szCs w:val="24"/>
+        </w:rPr>
+        <w:t> Segmented patient stays to identify resource-heavy versus routine admission patterns.</w:t>
+      </w:r>
+    </w:p>
+    <w:p>
+      <w:pPr>
+        <w:numPr>
+          <w:ilvl w:val="0"/>
+          <w:numId w:val="3"/>
+        </w:numPr>
+        <w:rPr>
+          <w:rFonts w:ascii="Times New Roman" w:hAnsi="Times New Roman" w:cs="Times New Roman"/>
+          <w:sz w:val="24"/>
+          <w:szCs w:val="24"/>
+        </w:rPr>
+      </w:pPr>
+      <w:r>
+        <w:rPr>
+          <w:rFonts w:ascii="Times New Roman" w:hAnsi="Times New Roman" w:cs="Times New Roman"/>
+          <w:b/>
+          <w:bCs/>
+          <w:sz w:val="24"/>
+          <w:szCs w:val="24"/>
+        </w:rPr>
+        <w:t>Capacity Scorecards:</w:t>
+      </w:r>
+      <w:r>
+        <w:rPr>
+          <w:rFonts w:ascii="Times New Roman" w:hAnsi="Times New Roman" w:cs="Times New Roman"/>
+          <w:sz w:val="24"/>
+          <w:szCs w:val="24"/>
+        </w:rPr>
+        <w:t> Real-time summary of active facility counts and estimated occupancy rates.</w:t>
+      </w:r>
+    </w:p>
+    <w:p>
+      <w:pPr>
+        <w:numPr>
+          <w:ilvl w:val="0"/>
+          <w:numId w:val="3"/>
+        </w:numPr>
+        <w:rPr>
+          <w:rFonts w:ascii="Times New Roman" w:hAnsi="Times New Roman" w:cs="Times New Roman"/>
+          <w:sz w:val="24"/>
+          <w:szCs w:val="24"/>
+        </w:rPr>
+      </w:pPr>
+      <w:r>
+        <w:rPr>
+          <w:rFonts w:ascii="Times New Roman" w:hAnsi="Times New Roman" w:cs="Times New Roman"/>
+          <w:b/>
+          <w:bCs/>
+          <w:sz w:val="24"/>
+          <w:szCs w:val="24"/>
+        </w:rPr>
+        <w:t>Advanced Data Segmentation:</w:t>
+      </w:r>
+      <w:r>
+        <w:rPr>
+          <w:rFonts w:ascii="Times New Roman" w:hAnsi="Times New Roman" w:cs="Times New Roman"/>
+          <w:sz w:val="24"/>
+          <w:szCs w:val="24"/>
+        </w:rPr>
+        <w:t> Used Pandas cut functionality to categorize operational efficiency based on treatment timelines.</w:t>
+      </w:r>
+    </w:p>
+    <w:p>
+      <w:pPr>
+        <w:rPr>
+          <w:rFonts w:ascii="Times New Roman" w:hAnsi="Times New Roman" w:cs="Times New Roman"/>
+          <w:sz w:val="24"/>
+          <w:szCs w:val="24"/>
+        </w:rPr>
+      </w:pPr>
+      <w:r>
+        <w:rPr>
+          <w:rFonts w:ascii="Times New Roman" w:hAnsi="Times New Roman" w:cs="Times New Roman"/>
+          <w:b/>
+          <w:bCs/>
+          <w:sz w:val="24"/>
+          <w:szCs w:val="24"/>
+        </w:rPr>
+        <w:t>Operational Impact:</w:t>
+      </w:r>
+      <w:r>
+        <w:rPr>
+          <w:rFonts w:ascii="Times New Roman" w:hAnsi="Times New Roman" w:cs="Times New Roman"/>
+          <w:sz w:val="24"/>
+          <w:szCs w:val="24"/>
+        </w:rPr>
+        <w:t> Allows administrators to balance patient load across facilities and identify areas for potential capacity expansion or efficiency improvements.</w:t>
       </w:r>
     </w:p>
     <w:p>
@@ -350,6 +823,304 @@
 <file path=word/numbering.xml><?xml version="1.0" encoding="utf-8"?>
 <w:numbering xmlns:wpc="http://schemas.microsoft.com/office/word/2010/wordprocessingCanvas" xmlns:cx="http://schemas.microsoft.com/office/drawing/2014/chartex" xmlns:cx1="http://schemas.microsoft.com/office/drawing/2015/9/8/chartex" xmlns:cx2="http://schemas.microsoft.com/office/drawing/2015/10/21/chartex" xmlns:cx3="http://schemas.microsoft.com/office/drawing/2016/5/9/chartex" xmlns:cx4="http://schemas.microsoft.com/office/drawing/2016/5/10/chartex" xmlns:cx5="http://schemas.microsoft.com/office/drawing/2016/5/11/chartex" xmlns:cx6="http://schemas.microsoft.com/office/drawing/2016/5/12/chartex" xmlns:cx7="http://schemas.microsoft.com/office/drawing/2016/5/13/chartex" xmlns:cx8="http://schemas.microsoft.com/office/drawing/2016/5/14/chartex" xmlns:mc="http://schemas.openxmlformats.org/markup-compatibility/2006" xmlns:aink="http://schemas.microsoft.com/office/drawing/2016/ink" xmlns:am3d="http://schemas.microsoft.com/office/drawing/2017/model3d" xmlns:o="urn:schemas-microsoft-com:office:office" xmlns:oel="http://schemas.microsoft.com/office/2019/extlst" xmlns:r="http://schemas.openxmlformats.org/officeDocument/2006/relationships" xmlns:m="http://schemas.openxmlformats.org/officeDocument/2006/math" xmlns:v="urn:schemas-microsoft-com:vml" xmlns:wp14="http://schemas.microsoft.com/office/word/2010/wordprocessingDrawing" xmlns:wp="http://schemas.openxmlformats.org/drawingml/2006/wordprocessingDrawing" xmlns:w10="urn:schemas-microsoft-com:office:word" xmlns:w="http://schemas.openxmlformats.org/wordprocessingml/2006/main" xmlns:w14="http://schemas.microsoft.com/office/word/2010/wordml" xmlns:w15="http://schemas.microsoft.com/office/word/2012/wordml" xmlns:w16cex="http://schemas.microsoft.com/office/word/2018/wordml/cex" xmlns:w16cid="http://schemas.microsoft.com/office/word/2016/wordml/cid" xmlns:w16="http://schemas.microsoft.com/office/word/2018/wordml" xmlns:w16du="http://schemas.microsoft.com/office/word/2023/wordml/word16du" xmlns:w16sdtdh="http://schemas.microsoft.com/office/word/2020/wordml/sdtdatahash" xmlns:w16sdtfl="http://schemas.microsoft.com/office/word/2024/wordml/sdtformatlock" xmlns:w16se="http://schemas.microsoft.com/office/word/2015/wordml/symex" xmlns:wpg="http://schemas.microsoft.com/office/word/2010/wordprocessingGroup" xmlns:wpi="http://schemas.microsoft.com/office/word/2010/wordprocessingInk" xmlns:wne="http://schemas.microsoft.com/office/word/2006/wordml" xmlns:wps="http://schemas.microsoft.com/office/word/2010/wordprocessingShape" mc:Ignorable="w14 w15 w16se w16cid w16 w16cex w16sdtdh w16sdtfl w16du wp14">
   <w:abstractNum w:abstractNumId="0" w15:restartNumberingAfterBreak="0">
+    <w:nsid w:val="0671489D"/>
+    <w:multiLevelType w:val="multilevel"/>
+    <w:tmpl w:val="E1C6FBD8"/>
+    <w:lvl w:ilvl="0">
+      <w:start w:val="1"/>
+      <w:numFmt w:val="bullet"/>
+      <w:lvlText w:val=""/>
+      <w:lvlJc w:val="left"/>
+      <w:pPr>
+        <w:tabs>
+          <w:tab w:val="num" w:pos="720"/>
+        </w:tabs>
+        <w:ind w:left="720" w:hanging="360"/>
+      </w:pPr>
+      <w:rPr>
+        <w:rFonts w:ascii="Symbol" w:hAnsi="Symbol" w:hint="default"/>
+        <w:sz w:val="20"/>
+      </w:rPr>
+    </w:lvl>
+    <w:lvl w:ilvl="1" w:tentative="1">
+      <w:start w:val="1"/>
+      <w:numFmt w:val="bullet"/>
+      <w:lvlText w:val="o"/>
+      <w:lvlJc w:val="left"/>
+      <w:pPr>
+        <w:tabs>
+          <w:tab w:val="num" w:pos="1440"/>
+        </w:tabs>
+        <w:ind w:left="1440" w:hanging="360"/>
+      </w:pPr>
+      <w:rPr>
+        <w:rFonts w:ascii="Courier New" w:hAnsi="Courier New" w:hint="default"/>
+        <w:sz w:val="20"/>
+      </w:rPr>
+    </w:lvl>
+    <w:lvl w:ilvl="2" w:tentative="1">
+      <w:start w:val="1"/>
+      <w:numFmt w:val="bullet"/>
+      <w:lvlText w:val=""/>
+      <w:lvlJc w:val="left"/>
+      <w:pPr>
+        <w:tabs>
+          <w:tab w:val="num" w:pos="2160"/>
+        </w:tabs>
+        <w:ind w:left="2160" w:hanging="360"/>
+      </w:pPr>
+      <w:rPr>
+        <w:rFonts w:ascii="Wingdings" w:hAnsi="Wingdings" w:hint="default"/>
+        <w:sz w:val="20"/>
+      </w:rPr>
+    </w:lvl>
+    <w:lvl w:ilvl="3" w:tentative="1">
+      <w:start w:val="1"/>
+      <w:numFmt w:val="bullet"/>
+      <w:lvlText w:val=""/>
+      <w:lvlJc w:val="left"/>
+      <w:pPr>
+        <w:tabs>
+          <w:tab w:val="num" w:pos="2880"/>
+        </w:tabs>
+        <w:ind w:left="2880" w:hanging="360"/>
+      </w:pPr>
+      <w:rPr>
+        <w:rFonts w:ascii="Wingdings" w:hAnsi="Wingdings" w:hint="default"/>
+        <w:sz w:val="20"/>
+      </w:rPr>
+    </w:lvl>
+    <w:lvl w:ilvl="4" w:tentative="1">
+      <w:start w:val="1"/>
+      <w:numFmt w:val="bullet"/>
+      <w:lvlText w:val=""/>
+      <w:lvlJc w:val="left"/>
+      <w:pPr>
+        <w:tabs>
+          <w:tab w:val="num" w:pos="3600"/>
+        </w:tabs>
+        <w:ind w:left="3600" w:hanging="360"/>
+      </w:pPr>
+      <w:rPr>
+        <w:rFonts w:ascii="Wingdings" w:hAnsi="Wingdings" w:hint="default"/>
+        <w:sz w:val="20"/>
+      </w:rPr>
+    </w:lvl>
+    <w:lvl w:ilvl="5" w:tentative="1">
+      <w:start w:val="1"/>
+      <w:numFmt w:val="bullet"/>
+      <w:lvlText w:val=""/>
+      <w:lvlJc w:val="left"/>
+      <w:pPr>
+        <w:tabs>
+          <w:tab w:val="num" w:pos="4320"/>
+        </w:tabs>
+        <w:ind w:left="4320" w:hanging="360"/>
+      </w:pPr>
+      <w:rPr>
+        <w:rFonts w:ascii="Wingdings" w:hAnsi="Wingdings" w:hint="default"/>
+        <w:sz w:val="20"/>
+      </w:rPr>
+    </w:lvl>
+    <w:lvl w:ilvl="6" w:tentative="1">
+      <w:start w:val="1"/>
+      <w:numFmt w:val="bullet"/>
+      <w:lvlText w:val=""/>
+      <w:lvlJc w:val="left"/>
+      <w:pPr>
+        <w:tabs>
+          <w:tab w:val="num" w:pos="5040"/>
+        </w:tabs>
+        <w:ind w:left="5040" w:hanging="360"/>
+      </w:pPr>
+      <w:rPr>
+        <w:rFonts w:ascii="Wingdings" w:hAnsi="Wingdings" w:hint="default"/>
+        <w:sz w:val="20"/>
+      </w:rPr>
+    </w:lvl>
+    <w:lvl w:ilvl="7" w:tentative="1">
+      <w:start w:val="1"/>
+      <w:numFmt w:val="bullet"/>
+      <w:lvlText w:val=""/>
+      <w:lvlJc w:val="left"/>
+      <w:pPr>
+        <w:tabs>
+          <w:tab w:val="num" w:pos="5760"/>
+        </w:tabs>
+        <w:ind w:left="5760" w:hanging="360"/>
+      </w:pPr>
+      <w:rPr>
+        <w:rFonts w:ascii="Wingdings" w:hAnsi="Wingdings" w:hint="default"/>
+        <w:sz w:val="20"/>
+      </w:rPr>
+    </w:lvl>
+    <w:lvl w:ilvl="8" w:tentative="1">
+      <w:start w:val="1"/>
+      <w:numFmt w:val="bullet"/>
+      <w:lvlText w:val=""/>
+      <w:lvlJc w:val="left"/>
+      <w:pPr>
+        <w:tabs>
+          <w:tab w:val="num" w:pos="6480"/>
+        </w:tabs>
+        <w:ind w:left="6480" w:hanging="360"/>
+      </w:pPr>
+      <w:rPr>
+        <w:rFonts w:ascii="Wingdings" w:hAnsi="Wingdings" w:hint="default"/>
+        <w:sz w:val="20"/>
+      </w:rPr>
+    </w:lvl>
+  </w:abstractNum>
+  <w:abstractNum w:abstractNumId="1" w15:restartNumberingAfterBreak="0">
+    <w:nsid w:val="44716224"/>
+    <w:multiLevelType w:val="multilevel"/>
+    <w:tmpl w:val="9D648576"/>
+    <w:lvl w:ilvl="0">
+      <w:start w:val="1"/>
+      <w:numFmt w:val="bullet"/>
+      <w:lvlText w:val=""/>
+      <w:lvlJc w:val="left"/>
+      <w:pPr>
+        <w:tabs>
+          <w:tab w:val="num" w:pos="720"/>
+        </w:tabs>
+        <w:ind w:left="720" w:hanging="360"/>
+      </w:pPr>
+      <w:rPr>
+        <w:rFonts w:ascii="Symbol" w:hAnsi="Symbol" w:hint="default"/>
+        <w:sz w:val="20"/>
+      </w:rPr>
+    </w:lvl>
+    <w:lvl w:ilvl="1" w:tentative="1">
+      <w:start w:val="1"/>
+      <w:numFmt w:val="bullet"/>
+      <w:lvlText w:val="o"/>
+      <w:lvlJc w:val="left"/>
+      <w:pPr>
+        <w:tabs>
+          <w:tab w:val="num" w:pos="1440"/>
+        </w:tabs>
+        <w:ind w:left="1440" w:hanging="360"/>
+      </w:pPr>
+      <w:rPr>
+        <w:rFonts w:ascii="Courier New" w:hAnsi="Courier New" w:hint="default"/>
+        <w:sz w:val="20"/>
+      </w:rPr>
+    </w:lvl>
+    <w:lvl w:ilvl="2" w:tentative="1">
+      <w:start w:val="1"/>
+      <w:numFmt w:val="bullet"/>
+      <w:lvlText w:val=""/>
+      <w:lvlJc w:val="left"/>
+      <w:pPr>
+        <w:tabs>
+          <w:tab w:val="num" w:pos="2160"/>
+        </w:tabs>
+        <w:ind w:left="2160" w:hanging="360"/>
+      </w:pPr>
+      <w:rPr>
+        <w:rFonts w:ascii="Wingdings" w:hAnsi="Wingdings" w:hint="default"/>
+        <w:sz w:val="20"/>
+      </w:rPr>
+    </w:lvl>
+    <w:lvl w:ilvl="3" w:tentative="1">
+      <w:start w:val="1"/>
+      <w:numFmt w:val="bullet"/>
+      <w:lvlText w:val=""/>
+      <w:lvlJc w:val="left"/>
+      <w:pPr>
+        <w:tabs>
+          <w:tab w:val="num" w:pos="2880"/>
+        </w:tabs>
+        <w:ind w:left="2880" w:hanging="360"/>
+      </w:pPr>
+      <w:rPr>
+        <w:rFonts w:ascii="Wingdings" w:hAnsi="Wingdings" w:hint="default"/>
+        <w:sz w:val="20"/>
+      </w:rPr>
+    </w:lvl>
+    <w:lvl w:ilvl="4" w:tentative="1">
+      <w:start w:val="1"/>
+      <w:numFmt w:val="bullet"/>
+      <w:lvlText w:val=""/>
+      <w:lvlJc w:val="left"/>
+      <w:pPr>
+        <w:tabs>
+          <w:tab w:val="num" w:pos="3600"/>
+        </w:tabs>
+        <w:ind w:left="3600" w:hanging="360"/>
+      </w:pPr>
+      <w:rPr>
+        <w:rFonts w:ascii="Wingdings" w:hAnsi="Wingdings" w:hint="default"/>
+        <w:sz w:val="20"/>
+      </w:rPr>
+    </w:lvl>
+    <w:lvl w:ilvl="5" w:tentative="1">
+      <w:start w:val="1"/>
+      <w:numFmt w:val="bullet"/>
+      <w:lvlText w:val=""/>
+      <w:lvlJc w:val="left"/>
+      <w:pPr>
+        <w:tabs>
+          <w:tab w:val="num" w:pos="4320"/>
+        </w:tabs>
+        <w:ind w:left="4320" w:hanging="360"/>
+      </w:pPr>
+      <w:rPr>
+        <w:rFonts w:ascii="Wingdings" w:hAnsi="Wingdings" w:hint="default"/>
+        <w:sz w:val="20"/>
+      </w:rPr>
+    </w:lvl>
+    <w:lvl w:ilvl="6" w:tentative="1">
+      <w:start w:val="1"/>
+      <w:numFmt w:val="bullet"/>
+      <w:lvlText w:val=""/>
+      <w:lvlJc w:val="left"/>
+      <w:pPr>
+        <w:tabs>
+          <w:tab w:val="num" w:pos="5040"/>
+        </w:tabs>
+        <w:ind w:left="5040" w:hanging="360"/>
+      </w:pPr>
+      <w:rPr>
+        <w:rFonts w:ascii="Wingdings" w:hAnsi="Wingdings" w:hint="default"/>
+        <w:sz w:val="20"/>
+      </w:rPr>
+    </w:lvl>
+    <w:lvl w:ilvl="7" w:tentative="1">
+      <w:start w:val="1"/>
+      <w:numFmt w:val="bullet"/>
+      <w:lvlText w:val=""/>
+      <w:lvlJc w:val="left"/>
+      <w:pPr>
+        <w:tabs>
+          <w:tab w:val="num" w:pos="5760"/>
+        </w:tabs>
+        <w:ind w:left="5760" w:hanging="360"/>
+      </w:pPr>
+      <w:rPr>
+        <w:rFonts w:ascii="Wingdings" w:hAnsi="Wingdings" w:hint="default"/>
+        <w:sz w:val="20"/>
+      </w:rPr>
+    </w:lvl>
+    <w:lvl w:ilvl="8" w:tentative="1">
+      <w:start w:val="1"/>
+      <w:numFmt w:val="bullet"/>
+      <w:lvlText w:val=""/>
+      <w:lvlJc w:val="left"/>
+      <w:pPr>
+        <w:tabs>
+          <w:tab w:val="num" w:pos="6480"/>
+        </w:tabs>
+        <w:ind w:left="6480" w:hanging="360"/>
+      </w:pPr>
+      <w:rPr>
+        <w:rFonts w:ascii="Wingdings" w:hAnsi="Wingdings" w:hint="default"/>
+        <w:sz w:val="20"/>
+      </w:rPr>
+    </w:lvl>
+  </w:abstractNum>
+  <w:abstractNum w:abstractNumId="2" w15:restartNumberingAfterBreak="0">
     <w:nsid w:val="646372F0"/>
     <w:multiLevelType w:val="multilevel"/>
     <w:tmpl w:val="1F3493B2"/>
@@ -463,6 +1234,12 @@
     </w:lvl>
   </w:abstractNum>
   <w:num w:numId="1" w16cid:durableId="452871454">
+    <w:abstractNumId w:val="2"/>
+  </w:num>
+  <w:num w:numId="2" w16cid:durableId="841118234">
+    <w:abstractNumId w:val="1"/>
+  </w:num>
+  <w:num w:numId="3" w16cid:durableId="434836242">
     <w:abstractNumId w:val="0"/>
   </w:num>
 </w:numbering>

</xml_diff>